<commit_message>
Retarget submission to Computers & Geosciences
EMS desk-rejected (blank comments, an editorial scope decision). Retarget the
companion package to Computers & Geosciences:
- Cover letter: re-addressed to C&G, dated 22 June 2026; scope paragraph reframed
  around the computational-science/geosciences interface (reusable sigma-to-z
  algorithm, open-source pipeline, MIT licence + CI reproducibility); removed the
  original-software-publication framing. GitHub and Zenodo links unchanged.
- README target-journal line updated to C&G.
- build_docx comment made journal-agnostic (line numbers are an Elsevier req).

Manuscript body needs no change: it is journal-agnostic, and its Software
availability section, Highlights and graphical abstract already suit C&G.

Co-Authored-By: Claude Opus 4.8 (1M context) <noreply@anthropic.com>
</commit_message>
<xml_diff>
--- a/paper/CoverLetter.docx
+++ b/paper/CoverLetter.docx
@@ -12,7 +12,7 @@
           <w:b w:val="0"/>
           <w:i w:val="0"/>
         </w:rPr>
-        <w:t>16 June 2026</w:t>
+        <w:t>22 June 2026</w:t>
       </w:r>
     </w:p>
     <w:p>
@@ -27,7 +27,7 @@
         </w:rPr>
         <w:t>To the Editors-in-Chief,</w:t>
         <w:br/>
-        <w:t>Environmental Modelling &amp; Software</w:t>
+        <w:t>Computers &amp; Geosciences</w:t>
       </w:r>
     </w:p>
     <w:p>
@@ -53,7 +53,7 @@
           <w:b w:val="0"/>
           <w:i w:val="0"/>
         </w:rPr>
-        <w:t>We are pleased to submit our manuscript, “LakeForcing-OpenDrift: an open, reproducible pipeline for generating hydrodynamic and wind-wave forcing of inland lakes to drive Lagrangian transport models”, for consideration in Environmental Modelling &amp; Software as an original software publication.</w:t>
+        <w:t>We are pleased to submit our manuscript, “LakeForcing-OpenDrift: an open, reproducible pipeline for generating hydrodynamic and wind-wave forcing of inland lakes to drive Lagrangian transport models”, for consideration in Computers &amp; Geosciences.</w:t>
       </w:r>
     </w:p>
     <w:p>
@@ -92,7 +92,7 @@
           <w:b w:val="0"/>
           <w:i w:val="0"/>
         </w:rPr>
-        <w:t>We believe the work fits the scope of Environmental Modelling &amp; Software: it is a reusable, openly released modelling tool with a clearly described method, demonstrated generality, and full software and data availability. It addresses a concrete and timely barrier to environmental transport modelling in freshwater systems. The generality is supported by a model-to-model benchmark against an expert-built reservoir model and by an independent comparison of the exported surface temperature against satellite observations for four further lakes. We note that the openly released twelve-lake forcing dataset could form the basis of a companion data descriptor (e.g. in Data in Brief), which we would be glad to prepare as a linked co-submission should the editors consider it appropriate.</w:t>
+        <w:t>We believe the work fits the scope of Computers &amp; Geosciences as original research at the interface of computational science and the geosciences: it contributes a reusable algorithm and an openly released, reproducible software pipeline — centred on a fully specified sigma-to-z coupling that bridges a terrain-following hydrodynamic engine to a generic Lagrangian tracker — together with a demonstration of its generality across twelve lakes and full software and data availability. It addresses a concrete and timely computational barrier to environmental transport modelling in freshwater systems. The generality is supported by a model-to-model benchmark against an expert-built reservoir model and by an independent comparison of the exported surface temperature against satellite observations for four further lakes. The complete source code is released under the MIT licence with a continuous-integration test capsule, and the generated twelve-lake forcing dataset is openly archived, so that the reported results are fully reproducible. We would also be glad to prepare a companion data descriptor for the forcing dataset as a linked co-submission (e.g. in Data in Brief) should the editors consider it appropriate.</w:t>
       </w:r>
     </w:p>
     <w:p>

</xml_diff>

<commit_message>
Rename software to LakeForcing (drop -OpenDrift)
Rename the product/software from LakeForcing-OpenDrift to LakeForcing across all
tracked text (manuscript, README, CITATION.cff, .zenodo.json, requirements.txt,
builders, and in-script labels) and update the GitHub URLs to
github.com/vaspapa79/LakeForcing. Regenerated the two name-bearing images
(architecture diagram, graphical abstract) and rebuilt the docx, cover letter and
highlights. OpenDrift now appears only as the named demonstrator. The local
working folder and the EMS_manuscript filenames are unchanged.

NOTE: the live GitHub repo still needs renaming to LakeForcing for the new URLs
to resolve (blocked here pending explicit authorization).

Co-Authored-By: Claude Opus 4.8 (1M context) <noreply@anthropic.com>
</commit_message>
<xml_diff>
--- a/paper/CoverLetter.docx
+++ b/paper/CoverLetter.docx
@@ -53,7 +53,7 @@
           <w:b w:val="0"/>
           <w:i w:val="0"/>
         </w:rPr>
-        <w:t>We are pleased to submit our manuscript, “LakeForcing-OpenDrift: a σ-to-z coupling algorithm and open pipeline for hydrodynamic and wind-wave forcing of inland lakes to drive Lagrangian transport models”, for consideration in Computers &amp; Geosciences.</w:t>
+        <w:t>We are pleased to submit our manuscript, “LakeForcing: a σ-to-z coupling algorithm and open pipeline for hydrodynamic and wind-wave forcing of inland lakes to drive Lagrangian transport models”, for consideration in Computers &amp; Geosciences.</w:t>
       </w:r>
     </w:p>
     <w:p>
@@ -79,7 +79,7 @@
           <w:b w:val="0"/>
           <w:i w:val="0"/>
         </w:rPr>
-        <w:t>Our manuscript presents LakeForcing-OpenDrift, an open and reproducible Python pipeline that assembles bathymetry and meteorology from open global datasets, automatically configures and runs a coupled Delft3D-FLOW + Delft3D-WAVE (SWAN) simulation for an arbitrary lake, and exports CF-compliant NetCDF that drives the OpenDrift particle tracker without modification. The methodological core is a fully specified transform that bridges Delft3D's terrain-following sigma-layers to OpenDrift's fixed metric z-levels, together with the curvilinear-to-regular regridding, velocity rotation and surface Stokes-drift derivation needed to make lake hydrodynamics ingestible by a generic ocean tracker. We demonstrate the pipeline, unchanged, across twelve morphologically and climatically diverse lakes on all inhabited continents, from 36°S to 60°N.</w:t>
+        <w:t>Our manuscript presents LakeForcing, an open and reproducible Python pipeline that assembles bathymetry and meteorology from open global datasets, automatically configures and runs a coupled Delft3D-FLOW + Delft3D-WAVE (SWAN) simulation for an arbitrary lake, and exports CF-compliant NetCDF that drives the OpenDrift particle tracker without modification. The methodological core is a fully specified transform that bridges Delft3D's terrain-following sigma-layers to OpenDrift's fixed metric z-levels, together with the curvilinear-to-regular regridding, velocity rotation and surface Stokes-drift derivation needed to make lake hydrodynamics ingestible by a generic ocean tracker. We demonstrate the pipeline, unchanged, across twelve morphologically and climatically diverse lakes on all inhabited continents, from 36°S to 60°N.</w:t>
       </w:r>
     </w:p>
     <w:p>
@@ -115,7 +115,7 @@
             <w:rFonts w:ascii="Times New Roman" w:hAnsi="Times New Roman"/>
             <w:sz w:val="22"/>
           </w:rPr>
-          <w:t xml:space="preserve">https://github.com/vaspapa79/LakeForcing-OpenDrift</w:t>
+          <w:t xml:space="preserve">https://github.com/vaspapa79/LakeForcing</w:t>
         </w:r>
       </w:hyperlink>
       <w:r>

</xml_diff>